<commit_message>
Completed a lot of work
</commit_message>
<xml_diff>
--- a/DB Model and schema.docx
+++ b/DB Model and schema.docx
@@ -109,13 +109,8 @@
       </w:r>
       <w:proofErr w:type="gramEnd"/>
       <w:r>
-        <w:t xml:space="preserve">d </w:t>
-      </w:r>
-      <w:proofErr w:type="spellStart"/>
-      <w:r>
-        <w:t>ai_audit_log</w:t>
-      </w:r>
-      <w:proofErr w:type="spellEnd"/>
+        <w:t>d ai_audit_log</w:t>
+      </w:r>
     </w:p>
     <w:p>
       <w:r>
@@ -276,15 +271,7 @@
       </w:r>
       <w:proofErr w:type="spellEnd"/>
       <w:r>
-        <w:t xml:space="preserve">         | </w:t>
-      </w:r>
-      <w:proofErr w:type="spellStart"/>
-      <w:r>
-        <w:t>jsonb</w:t>
-      </w:r>
-      <w:proofErr w:type="spellEnd"/>
-      <w:r>
-        <w:t xml:space="preserve">                    |           |          |</w:t>
+        <w:t xml:space="preserve">         | jsonb                    |           |          |</w:t>
       </w:r>
     </w:p>
     <w:p>
@@ -597,26 +584,18 @@
       </w:r>
       <w:proofErr w:type="spellEnd"/>
       <w:r>
-        <w:t xml:space="preserve">   | </w:t>
-      </w:r>
-      <w:proofErr w:type="spellStart"/>
+        <w:t xml:space="preserve">   | uuid                     |           | not null | </w:t>
+      </w:r>
+      <w:proofErr w:type="spellStart"/>
+      <w:r>
+        <w:t>gen_random_</w:t>
+      </w:r>
+      <w:proofErr w:type="gramStart"/>
       <w:r>
         <w:t>uuid</w:t>
       </w:r>
       <w:proofErr w:type="spellEnd"/>
       <w:r>
-        <w:t xml:space="preserve">                     |           | not null | </w:t>
-      </w:r>
-      <w:proofErr w:type="spellStart"/>
-      <w:r>
-        <w:t>gen_random_</w:t>
-      </w:r>
-      <w:proofErr w:type="gramStart"/>
-      <w:r>
-        <w:t>uuid</w:t>
-      </w:r>
-      <w:proofErr w:type="spellEnd"/>
-      <w:r>
         <w:t>(</w:t>
       </w:r>
       <w:proofErr w:type="gramEnd"/>
@@ -642,51 +621,35 @@
       </w:r>
       <w:proofErr w:type="gramEnd"/>
       <w:r>
+        <w:t xml:space="preserve"> uuid                     |           | not null |</w:t>
+      </w:r>
+    </w:p>
+    <w:p>
+      <w:r>
+        <w:t xml:space="preserve"> type       | text                     |           | not null |</w:t>
+      </w:r>
+    </w:p>
+    <w:p>
+      <w:r>
+        <w:t xml:space="preserve"> subject    | text                     |           | not null |</w:t>
+      </w:r>
+    </w:p>
+    <w:p>
+      <w:r>
+        <w:t xml:space="preserve"> body       | text                     |           | not null |</w:t>
+      </w:r>
+    </w:p>
+    <w:p>
+      <w:r>
         <w:t xml:space="preserve"> </w:t>
       </w:r>
       <w:proofErr w:type="spellStart"/>
       <w:r>
-        <w:t>uuid</w:t>
-      </w:r>
-      <w:proofErr w:type="spellEnd"/>
-      <w:r>
-        <w:t xml:space="preserve">                     |           | not null |</w:t>
-      </w:r>
-    </w:p>
-    <w:p>
-      <w:r>
-        <w:t xml:space="preserve"> type       | text                     |           | not null |</w:t>
-      </w:r>
-    </w:p>
-    <w:p>
-      <w:r>
-        <w:t xml:space="preserve"> subject    | text                     |           | not null |</w:t>
-      </w:r>
-    </w:p>
-    <w:p>
-      <w:r>
-        <w:t xml:space="preserve"> body       | text                     |           | not null |</w:t>
-      </w:r>
-    </w:p>
-    <w:p>
-      <w:r>
-        <w:t xml:space="preserve"> </w:t>
-      </w:r>
-      <w:proofErr w:type="spellStart"/>
-      <w:r>
         <w:t>created_by</w:t>
       </w:r>
       <w:proofErr w:type="spellEnd"/>
       <w:r>
-        <w:t xml:space="preserve"> | </w:t>
-      </w:r>
-      <w:proofErr w:type="spellStart"/>
-      <w:r>
-        <w:t>uuid</w:t>
-      </w:r>
-      <w:proofErr w:type="spellEnd"/>
-      <w:r>
-        <w:t xml:space="preserve">                     |           |          |</w:t>
+        <w:t xml:space="preserve"> | uuid                     |           |          |</w:t>
       </w:r>
     </w:p>
     <w:p>
@@ -967,15 +930,7 @@
       </w:r>
       <w:proofErr w:type="spellEnd"/>
       <w:r>
-        <w:t xml:space="preserve">    | </w:t>
-      </w:r>
-      <w:proofErr w:type="spellStart"/>
-      <w:r>
-        <w:t>uuid</w:t>
-      </w:r>
-      <w:proofErr w:type="spellEnd"/>
-      <w:r>
-        <w:t xml:space="preserve">                     |           | not null | </w:t>
+        <w:t xml:space="preserve">    | uuid                     |           | not null | </w:t>
       </w:r>
       <w:proofErr w:type="spellStart"/>
       <w:r>
@@ -1450,26 +1405,18 @@
       </w:r>
       <w:proofErr w:type="spellEnd"/>
       <w:r>
-        <w:t xml:space="preserve">   | </w:t>
-      </w:r>
-      <w:proofErr w:type="spellStart"/>
+        <w:t xml:space="preserve">   | uuid                     |           | not null | </w:t>
+      </w:r>
+      <w:proofErr w:type="spellStart"/>
+      <w:r>
+        <w:t>gen_random_</w:t>
+      </w:r>
+      <w:proofErr w:type="gramStart"/>
       <w:r>
         <w:t>uuid</w:t>
       </w:r>
       <w:proofErr w:type="spellEnd"/>
       <w:r>
-        <w:t xml:space="preserve">                     |           | not null | </w:t>
-      </w:r>
-      <w:proofErr w:type="spellStart"/>
-      <w:r>
-        <w:t>gen_random_</w:t>
-      </w:r>
-      <w:proofErr w:type="gramStart"/>
-      <w:r>
-        <w:t>uuid</w:t>
-      </w:r>
-      <w:proofErr w:type="spellEnd"/>
-      <w:r>
         <w:t>(</w:t>
       </w:r>
       <w:proofErr w:type="gramEnd"/>
@@ -1518,36 +1465,20 @@
       </w:r>
       <w:proofErr w:type="gramEnd"/>
       <w:r>
+        <w:t xml:space="preserve"> uuid                     |           |          |</w:t>
+      </w:r>
+    </w:p>
+    <w:p>
+      <w:r>
         <w:t xml:space="preserve"> </w:t>
       </w:r>
       <w:proofErr w:type="spellStart"/>
       <w:r>
-        <w:t>uuid</w:t>
-      </w:r>
-      <w:proofErr w:type="spellEnd"/>
-      <w:r>
-        <w:t xml:space="preserve">                     |           |          |</w:t>
-      </w:r>
-    </w:p>
-    <w:p>
-      <w:r>
-        <w:t xml:space="preserve"> </w:t>
-      </w:r>
-      <w:proofErr w:type="spellStart"/>
-      <w:r>
         <w:t>assigned_to</w:t>
       </w:r>
       <w:proofErr w:type="spellEnd"/>
       <w:r>
-        <w:t xml:space="preserve"> | </w:t>
-      </w:r>
-      <w:proofErr w:type="spellStart"/>
-      <w:r>
-        <w:t>uuid</w:t>
-      </w:r>
-      <w:proofErr w:type="spellEnd"/>
-      <w:r>
-        <w:t xml:space="preserve">                     |           |          |</w:t>
+        <w:t xml:space="preserve"> | uuid                     |           |          |</w:t>
       </w:r>
     </w:p>
     <w:p>

</xml_diff>